<commit_message>
feat: add DIRECT_SENT mechanism, /documents & /collections commands, re-ingestion progress, model drift null safety
- Add [DIRECT_SENT] marker in agent loop to let tools send Telegram messages directly without LLM duplication
- Add /documents slash command (lists all docs with collection and link status)
- Add /collections slash command (lists all collections as bulleted list)
- list_collections tool now uses DIRECT_SENT for deterministic output
- list_documents tool shows all documents with Not linked indicator
- Re-ingestion sends real-time Telegram progress messages per document
- Fix null safety in performMigration (max_seq_length ?? 512)
- Update OPENCLAW_INFINITE_MEMORY_SPEC_V5.md with all new features
- Clean up old browser screenshots from workspace/skills
</commit_message>
<xml_diff>
--- a/workspace/collections/Rods_Skills/2026DE ROD COELHO-English IT 9B.docx
+++ b/workspace/collections/Rods_Skills/2026DE ROD COELHO-English IT 9B.docx
@@ -112,17 +112,7 @@
           <w:sz w:val="18"/>
           <w:szCs w:val="18"/>
         </w:rPr>
-        <w:t xml:space="preserve"> </w:t>
-      </w:r>
-      <w:bookmarkStart w:id="0" w:name="_GoBack"/>
-      <w:bookmarkEnd w:id="0"/>
-      <w:r>
-        <w:rPr>
-          <w:rFonts w:ascii="Book Antiqua" w:hAnsi="Book Antiqua" w:cs="Arial"/>
-          <w:sz w:val="18"/>
-          <w:szCs w:val="18"/>
-        </w:rPr>
-        <w:t xml:space="preserve"> </w:t>
+        <w:t xml:space="preserve">  </w:t>
       </w:r>
       <w:proofErr w:type="gramStart"/>
       <w:r>
@@ -307,18 +297,38 @@
         </w:rPr>
         <w:t xml:space="preserve">e-mail: </w:t>
       </w:r>
-      <w:hyperlink r:id="rId8">
-        <w:r>
-          <w:rPr>
-            <w:rStyle w:val="LinkdaInternet"/>
-            <w:rFonts w:ascii="Book Antiqua" w:hAnsi="Book Antiqua" w:cs="Arial"/>
-            <w:sz w:val="18"/>
-            <w:szCs w:val="18"/>
-            <w:lang w:val="it-IT"/>
-          </w:rPr>
-          <w:t>rodrigopcoelho@hotmail.com</w:t>
-        </w:r>
-      </w:hyperlink>
+      <w:r>
+        <w:fldChar w:fldCharType="begin"/>
+      </w:r>
+      <w:r>
+        <w:rPr>
+          <w:lang w:val="pt-BR"/>
+        </w:rPr>
+        <w:instrText xml:space="preserve"> HYPERLINK "mailto:rodrigopcoelho@hotmail.com" \h </w:instrText>
+      </w:r>
+      <w:r>
+        <w:fldChar w:fldCharType="separate"/>
+      </w:r>
+      <w:r>
+        <w:rPr>
+          <w:rStyle w:val="LinkdaInternet"/>
+          <w:rFonts w:ascii="Book Antiqua" w:hAnsi="Book Antiqua" w:cs="Arial"/>
+          <w:sz w:val="18"/>
+          <w:szCs w:val="18"/>
+          <w:lang w:val="it-IT"/>
+        </w:rPr>
+        <w:t>rodrigopcoelho@hotmail.com</w:t>
+      </w:r>
+      <w:r>
+        <w:rPr>
+          <w:rStyle w:val="LinkdaInternet"/>
+          <w:rFonts w:ascii="Book Antiqua" w:hAnsi="Book Antiqua" w:cs="Arial"/>
+          <w:sz w:val="18"/>
+          <w:szCs w:val="18"/>
+          <w:lang w:val="it-IT"/>
+        </w:rPr>
+        <w:fldChar w:fldCharType="end"/>
+      </w:r>
       <w:r>
         <w:rPr>
           <w:rFonts w:ascii="Book Antiqua" w:hAnsi="Book Antiqua" w:cs="Arial"/>
@@ -6088,6 +6098,7 @@
               <w:jc w:val="both"/>
               <w:rPr>
                 <w:rFonts w:ascii="Book Antiqua" w:hAnsi="Book Antiqua" w:cs="Arial"/>
+                <w:i/>
                 <w:sz w:val="19"/>
                 <w:szCs w:val="19"/>
               </w:rPr>
@@ -6095,6 +6106,44 @@
             <w:r>
               <w:rPr>
                 <w:rFonts w:ascii="Book Antiqua" w:hAnsi="Book Antiqua" w:cs="Arial"/>
+                <w:i/>
+                <w:sz w:val="19"/>
+                <w:szCs w:val="19"/>
+              </w:rPr>
+              <w:t>Certified</w:t>
+            </w:r>
+            <w:bookmarkStart w:id="0" w:name="_GoBack"/>
+            <w:bookmarkEnd w:id="0"/>
+            <w:r>
+              <w:rPr>
+                <w:rFonts w:ascii="Book Antiqua" w:hAnsi="Book Antiqua" w:cs="Arial"/>
+                <w:i/>
+                <w:sz w:val="19"/>
+                <w:szCs w:val="19"/>
+              </w:rPr>
+              <w:t xml:space="preserve"> Scrum Master Exam Prep Boot Camp, 2026</w:t>
+            </w:r>
+          </w:p>
+          <w:p>
+            <w:pPr>
+              <w:widowControl w:val="0"/>
+              <w:numPr>
+                <w:ilvl w:val="0"/>
+                <w:numId w:val="4"/>
+              </w:numPr>
+              <w:ind w:left="284" w:hanging="284"/>
+              <w:jc w:val="both"/>
+              <w:rPr>
+                <w:rFonts w:ascii="Book Antiqua" w:hAnsi="Book Antiqua" w:cs="Arial"/>
+                <w:i/>
+                <w:sz w:val="19"/>
+                <w:szCs w:val="19"/>
+              </w:rPr>
+            </w:pPr>
+            <w:r>
+              <w:rPr>
+                <w:rFonts w:ascii="Book Antiqua" w:hAnsi="Book Antiqua" w:cs="Arial"/>
+                <w:i/>
                 <w:sz w:val="19"/>
                 <w:szCs w:val="19"/>
               </w:rPr>
@@ -6192,6 +6241,11 @@
               <w:t>2011</w:t>
             </w:r>
           </w:p>
+        </w:tc>
+        <w:tc>
+          <w:tcPr>
+            <w:tcW w:w="5337" w:type="dxa"/>
+          </w:tcPr>
           <w:p>
             <w:pPr>
               <w:widowControl w:val="0"/>
@@ -6199,7 +6253,7 @@
                 <w:ilvl w:val="0"/>
                 <w:numId w:val="4"/>
               </w:numPr>
-              <w:ind w:left="284" w:hanging="284"/>
+              <w:ind w:left="484" w:hanging="236"/>
               <w:jc w:val="both"/>
               <w:rPr>
                 <w:rFonts w:ascii="Book Antiqua" w:hAnsi="Book Antiqua" w:cs="Arial"/>
@@ -6225,11 +6279,6 @@
               <w:t>, 2010</w:t>
             </w:r>
           </w:p>
-        </w:tc>
-        <w:tc>
-          <w:tcPr>
-            <w:tcW w:w="5337" w:type="dxa"/>
-          </w:tcPr>
           <w:p>
             <w:pPr>
               <w:widowControl w:val="0"/>
@@ -6724,12 +6773,12 @@
       </w:pPr>
     </w:p>
     <w:sectPr>
-      <w:headerReference w:type="even" r:id="rId9"/>
-      <w:headerReference w:type="default" r:id="rId10"/>
-      <w:footerReference w:type="even" r:id="rId11"/>
-      <w:footerReference w:type="default" r:id="rId12"/>
-      <w:headerReference w:type="first" r:id="rId13"/>
-      <w:footerReference w:type="first" r:id="rId14"/>
+      <w:headerReference w:type="even" r:id="rId8"/>
+      <w:headerReference w:type="default" r:id="rId9"/>
+      <w:footerReference w:type="even" r:id="rId10"/>
+      <w:footerReference w:type="default" r:id="rId11"/>
+      <w:headerReference w:type="first" r:id="rId12"/>
+      <w:footerReference w:type="first" r:id="rId13"/>
       <w:pgSz w:w="11906" w:h="16838"/>
       <w:pgMar w:top="777" w:right="720" w:bottom="720" w:left="720" w:header="720" w:footer="0" w:gutter="0"/>
       <w:cols w:space="720"/>
@@ -8674,7 +8723,7 @@
 </file>
 
 <file path=customXml/itemProps1.xml><?xml version="1.0" encoding="utf-8"?>
-<ds:datastoreItem xmlns:ds="http://schemas.openxmlformats.org/officeDocument/2006/customXml" ds:itemID="{BE16F8C4-EE89-4AE6-9A72-E5835CDCF16D}">
+<ds:datastoreItem xmlns:ds="http://schemas.openxmlformats.org/officeDocument/2006/customXml" ds:itemID="{813AE510-F14E-47D8-B940-2DFA5C2FD314}">
   <ds:schemaRefs>
     <ds:schemaRef ds:uri="http://schemas.openxmlformats.org/officeDocument/2006/bibliography"/>
   </ds:schemaRefs>

</xml_diff>